<commit_message>
ecsr-35263: UT evidence doc (before/after) - date fix validated + user-approved
</commit_message>
<xml_diff>
--- a/workstreams/ecsr-35263-35264-sca-email/UT/UT_ECSR-35263.docx
+++ b/workstreams/ecsr-35263-35264-sca-email/UT/UT_ECSR-35263.docx
@@ -7,7 +7,7 @@
         <w:pStyle w:val="Title"/>
       </w:pPr>
       <w:r>
-        <w:t>User Test — ECSR-35263</w:t>
+        <w:t>Unit Test Evidence - ECSR-35263</w:t>
       </w:r>
     </w:p>
     <w:p>
@@ -15,15 +15,15 @@
         <w:rPr>
           <w:b/>
         </w:rPr>
-        <w:t>Workstream-HIJ: Issue_1044A — Scarborough Upstream Daily Partner Report email: email Production Date does not match the attached report date.</w:t>
+        <w:t>Daily report email: Production Date in the email subject/body did not match the attached report's date.</w:t>
       </w:r>
     </w:p>
     <w:p>
       <w:pPr>
-        <w:pStyle w:val="Heading1"/>
+        <w:pStyle w:val="Heading2"/>
       </w:pPr>
       <w:r>
-        <w:t>1. Document control</w:t>
+        <w:t>Document control</w:t>
       </w:r>
     </w:p>
     <w:tbl>
@@ -53,7 +53,7 @@
           </w:tcPr>
           <w:p>
             <w:r>
-              <w:t>ECSR-35263 (Critical / UAT_BLOCKER / SCA_STARTUP)</w:t>
+              <w:t>ECSR-35263 (Critical / UAT_BLOCKER)</w:t>
             </w:r>
           </w:p>
         </w:tc>
@@ -87,7 +87,7 @@
           </w:tcPr>
           <w:p>
             <w:r>
-              <w:t>Assignee</w:t>
+              <w:t>Environment</w:t>
             </w:r>
           </w:p>
         </w:tc>
@@ -97,7 +97,7 @@
           </w:tcPr>
           <w:p>
             <w:r>
-              <w:t>Choong-Yin Lee</w:t>
+              <w:t>COPSDEV / plutodev</w:t>
             </w:r>
           </w:p>
         </w:tc>
@@ -109,7 +109,7 @@
           </w:tcPr>
           <w:p>
             <w:r>
-              <w:t>Test environment</w:t>
+              <w:t>Report used</w:t>
             </w:r>
           </w:p>
         </w:tc>
@@ -119,7 +119,7 @@
           </w:tcPr>
           <w:p>
             <w:r>
-              <w:t>plutodev / COPSDEV (build+test) — ECaaS TEST = read-only recon only</w:t>
+              <w:t>R_BLP_DAILY_PROD_ALLOC_PLUTO (Burrup LNG Park Daily Production - Pluto)</w:t>
             </w:r>
           </w:p>
         </w:tc>
@@ -131,7 +131,7 @@
           </w:tcPr>
           <w:p>
             <w:r>
-              <w:t>Report under test</w:t>
+              <w:t>Fix</w:t>
             </w:r>
           </w:p>
         </w:tc>
@@ -141,7 +141,7 @@
           </w:tcPr>
           <w:p>
             <w:r>
-              <w:t>R_PLU_DAILY_PARTNER (reused per ticket to validate the shared defect)</w:t>
+              <w:t>ZWP_P_MAIL_UTIL.getReportDate(p_message_no) - resolve the date PER MESSAGE via REPORT_SEND_LOG (was: latest report of the type)</w:t>
             </w:r>
           </w:p>
         </w:tc>
@@ -153,7 +153,7 @@
           </w:tcPr>
           <w:p>
             <w:r>
-              <w:t>Status</w:t>
+              <w:t>Evidence</w:t>
             </w:r>
           </w:p>
         </w:tc>
@@ -163,7 +163,7 @@
           </w:tcPr>
           <w:p>
             <w:r>
-              <w:t>① BEFORE — defect validation (this revision)</w:t>
+              <w:t>Same 20-May report: MSG 412 (before fix) vs MSG 414 (after fix)</w:t>
             </w:r>
           </w:p>
         </w:tc>
@@ -171,18 +171,20 @@
     </w:tbl>
     <w:p>
       <w:pPr>
-        <w:pStyle w:val="Heading1"/>
+        <w:pStyle w:val="Heading2"/>
       </w:pPr>
       <w:r>
-        <w:t>2. Reported defect (Ruchi Doval, 22-Jun-2026)</w:t>
+        <w:t>Defect &amp; fix (summary)</w:t>
       </w:r>
     </w:p>
     <w:p>
       <w:r>
-        <w:rPr>
-          <w:b w:val="0"/>
-        </w:rPr>
-        <w:t>The Scarborough Upstream Daily Partner report was sent for two production dates separately (18-Jun-26, then 12-Jun-26). The received email's subject/body showed Production Date 18-Jun-26, but the attached report was actually for 12-Jun-26 — i.e. the email's stated date does not match the attached report.</w:t>
+        <w:t>BEFORE: getReportDate(p_message_code) returned the latest report date of the message TYPE; the scheduled ZWP_UPD_MHM_SUBJECT_AND_BODY business action stamped that one date into {production_day} on every message of the type -&gt; the email subject/body showed the wrong date while the attachment was correct.</w:t>
+      </w:r>
+    </w:p>
+    <w:p>
+      <w:r>
+        <w:t>AFTER: a new getReportDate(p_message_no) overload resolves the date from the message's OWN report (REPORT_SEND_LOG -&gt; TV_REPORT_GENERATED.report_date); both refresh procedures use NVL(getReportDate(msg_no), getReportDate(type)).</w:t>
       </w:r>
     </w:p>
     <w:p>
@@ -190,7 +192,7 @@
         <w:pStyle w:val="Heading1"/>
       </w:pPr>
       <w:r>
-        <w:t>3. ① BEFORE — evidence the defect is VALID</w:t>
+        <w:t>BEFORE FIX</w:t>
       </w:r>
     </w:p>
     <w:p>
@@ -198,15 +200,274 @@
         <w:pStyle w:val="Heading2"/>
       </w:pPr>
       <w:r>
-        <w:t>3.1 Actual occurrence on ECaaS TEST (Ruchi's two sends)</w:t>
+        <w:t>1.  Outgoing Messages screen</w:t>
+      </w:r>
+    </w:p>
+    <w:p>
+      <w:r>
+        <w:t>MSG 412 - R_BLP_DAILY_PROD_ALLOC_PLUTO. The attached report is for Production Date 20 May 2026.</w:t>
+      </w:r>
+    </w:p>
+    <w:p>
+      <w:r>
+        <w:drawing>
+          <wp:inline xmlns:a="http://schemas.openxmlformats.org/drawingml/2006/main" xmlns:pic="http://schemas.openxmlformats.org/drawingml/2006/picture">
+            <wp:extent cx="6035040" cy="3592286"/>
+            <wp:docPr id="1" name="Picture 1"/>
+            <wp:cNvGraphicFramePr>
+              <a:graphicFrameLocks noChangeAspect="1"/>
+            </wp:cNvGraphicFramePr>
+            <a:graphic>
+              <a:graphicData uri="http://schemas.openxmlformats.org/drawingml/2006/picture">
+                <pic:pic>
+                  <pic:nvPicPr>
+                    <pic:cNvPr id="0" name="before_412_grid.png"/>
+                    <pic:cNvPicPr/>
+                  </pic:nvPicPr>
+                  <pic:blipFill>
+                    <a:blip r:embed="rId9"/>
+                    <a:stretch>
+                      <a:fillRect/>
+                    </a:stretch>
+                  </pic:blipFill>
+                  <pic:spPr>
+                    <a:xfrm>
+                      <a:off x="0" y="0"/>
+                      <a:ext cx="6035040" cy="3592286"/>
+                    </a:xfrm>
+                    <a:prstGeom prst="rect"/>
+                  </pic:spPr>
+                </pic:pic>
+              </a:graphicData>
+            </a:graphic>
+          </wp:inline>
+        </w:drawing>
+      </w:r>
+    </w:p>
+    <w:p>
+      <w:pPr>
+        <w:pStyle w:val="Heading2"/>
+      </w:pPr>
+      <w:r>
+        <w:t>2.  Rendered outgoing message (Preview)</w:t>
       </w:r>
     </w:p>
     <w:p>
       <w:r>
         <w:rPr>
-          <w:b w:val="0"/>
+          <w:b/>
         </w:rPr>
-        <w:t>Both messages — sent separately at 11:45 and 13:26 on 22-Jun — were stamped with the SAME date (18 Jun 2026) in both the subject and the attachment file name, confirming the date is not resolved per send:</w:t>
+        <w:t xml:space="preserve">Subject: </w:t>
+      </w:r>
+      <w:r>
+        <w:t>Burrup LNG Park Daily Production Report 26 May 26</w:t>
+      </w:r>
+    </w:p>
+    <w:p>
+      <w:r>
+        <w:t>Rendered message body (MESSAGE_DRAFT):</w:t>
+      </w:r>
+    </w:p>
+    <w:tbl>
+      <w:tblPr>
+        <w:tblStyle w:val="TableGrid"/>
+        <w:tblW w:type="auto" w:w="0"/>
+        <w:tblLook w:firstColumn="1" w:firstRow="1" w:lastColumn="0" w:lastRow="0" w:noHBand="0" w:noVBand="1" w:val="04A0"/>
+      </w:tblPr>
+      <w:tblGrid>
+        <w:gridCol w:w="8640"/>
+      </w:tblGrid>
+      <w:tr>
+        <w:tc>
+          <w:tcPr>
+            <w:tcW w:type="dxa" w:w="8640"/>
+          </w:tcPr>
+          <w:p>
+            <w:r>
+              <w:t>Hi,</w:t>
+              <w:br/>
+              <w:br/>
+              <w:t>Please find attached Burrup LNG Park Daily Production Report (Pluto) for Production Date - 26 May 26.</w:t>
+              <w:br/>
+              <w:br/>
+              <w:t>Note this report is designed to meet the requirements of Burrup LNG Park Production Allocation Agreement (PAA) from the PAA Effective Date.</w:t>
+              <w:br/>
+              <w:br/>
+              <w:t>For any queries or issues please contact PlutoJVNotices@woodside.com.au.</w:t>
+              <w:br/>
+              <w:br/>
+              <w:t>Disclaimer - You are receiving this email as a designated recipient for the above-listed Report Type. If you no longer wish to receive these emails, please contact the Production &amp; Emission Allocation Team - Australian Business.</w:t>
+              <w:br/>
+              <w:br/>
+              <w:t>Regards,</w:t>
+              <w:br/>
+              <w:t>Prod Reporting</w:t>
+              <w:br/>
+              <w:t>Production &amp; Emission Allocation Team</w:t>
+              <w:br/>
+              <w:br/>
+              <w:br/>
+              <w:t>[This notification is automatically generated by Pluto Hub ECaaS.]</w:t>
+            </w:r>
+          </w:p>
+        </w:tc>
+      </w:tr>
+    </w:tbl>
+    <w:p>
+      <w:r>
+        <w:rPr>
+          <w:b/>
+          <w:color w:val="C00000"/>
+        </w:rPr>
+        <w:t>DEFECT: the attached report is 20 May 2026, but the email subject/body show 26 May 2026 (the latest report of the type).</w:t>
+      </w:r>
+    </w:p>
+    <w:p>
+      <w:pPr>
+        <w:pStyle w:val="Heading1"/>
+      </w:pPr>
+      <w:r>
+        <w:t>AFTER FIX</w:t>
+      </w:r>
+    </w:p>
+    <w:p>
+      <w:pPr>
+        <w:pStyle w:val="Heading2"/>
+      </w:pPr>
+      <w:r>
+        <w:t>1.  Outgoing Messages screen</w:t>
+      </w:r>
+    </w:p>
+    <w:p>
+      <w:r>
+        <w:t>MSG 414 - same R_BLP_DAILY_PROD_ALLOC_PLUTO report for Production Date 20 May 2026, after the fix.</w:t>
+      </w:r>
+    </w:p>
+    <w:p>
+      <w:r>
+        <w:drawing>
+          <wp:inline xmlns:a="http://schemas.openxmlformats.org/drawingml/2006/main" xmlns:pic="http://schemas.openxmlformats.org/drawingml/2006/picture">
+            <wp:extent cx="6035040" cy="3592286"/>
+            <wp:docPr id="2" name="Picture 2"/>
+            <wp:cNvGraphicFramePr>
+              <a:graphicFrameLocks noChangeAspect="1"/>
+            </wp:cNvGraphicFramePr>
+            <a:graphic>
+              <a:graphicData uri="http://schemas.openxmlformats.org/drawingml/2006/picture">
+                <pic:pic>
+                  <pic:nvPicPr>
+                    <pic:cNvPr id="0" name="after_414_grid.png"/>
+                    <pic:cNvPicPr/>
+                  </pic:nvPicPr>
+                  <pic:blipFill>
+                    <a:blip r:embed="rId10"/>
+                    <a:stretch>
+                      <a:fillRect/>
+                    </a:stretch>
+                  </pic:blipFill>
+                  <pic:spPr>
+                    <a:xfrm>
+                      <a:off x="0" y="0"/>
+                      <a:ext cx="6035040" cy="3592286"/>
+                    </a:xfrm>
+                    <a:prstGeom prst="rect"/>
+                  </pic:spPr>
+                </pic:pic>
+              </a:graphicData>
+            </a:graphic>
+          </wp:inline>
+        </w:drawing>
+      </w:r>
+    </w:p>
+    <w:p>
+      <w:pPr>
+        <w:pStyle w:val="Heading2"/>
+      </w:pPr>
+      <w:r>
+        <w:t>2.  Rendered outgoing message (Preview)</w:t>
+      </w:r>
+    </w:p>
+    <w:p>
+      <w:r>
+        <w:rPr>
+          <w:b/>
+        </w:rPr>
+        <w:t xml:space="preserve">Subject: </w:t>
+      </w:r>
+      <w:r>
+        <w:t>Burrup LNG Park Daily Production Report 20 May 26</w:t>
+      </w:r>
+    </w:p>
+    <w:p>
+      <w:r>
+        <w:t>Rendered message body (MESSAGE_DRAFT):</w:t>
+      </w:r>
+    </w:p>
+    <w:tbl>
+      <w:tblPr>
+        <w:tblStyle w:val="TableGrid"/>
+        <w:tblW w:type="auto" w:w="0"/>
+        <w:tblLook w:firstColumn="1" w:firstRow="1" w:lastColumn="0" w:lastRow="0" w:noHBand="0" w:noVBand="1" w:val="04A0"/>
+      </w:tblPr>
+      <w:tblGrid>
+        <w:gridCol w:w="8640"/>
+      </w:tblGrid>
+      <w:tr>
+        <w:tc>
+          <w:tcPr>
+            <w:tcW w:type="dxa" w:w="8640"/>
+          </w:tcPr>
+          <w:p>
+            <w:r>
+              <w:t>Hi,</w:t>
+              <w:br/>
+              <w:br/>
+              <w:t>Please find attached Burrup LNG Park Daily Production Report (Pluto) for Production Date - 20 May 26.</w:t>
+              <w:br/>
+              <w:br/>
+              <w:t>Note this report is designed to meet the requirements of Burrup LNG Park Production Allocation Agreement (PAA) from the PAA Effective Date.</w:t>
+              <w:br/>
+              <w:br/>
+              <w:t>For any queries or issues please contact PlutoJVNotices@woodside.com.au.</w:t>
+              <w:br/>
+              <w:br/>
+              <w:t>Disclaimer - You are receiving this email as a designated recipient for the above-listed Report Type. If you no longer wish to receive these emails, please contact the Production &amp; Emission Allocation Team - Australian Business.</w:t>
+              <w:br/>
+              <w:br/>
+              <w:t>Regards,</w:t>
+              <w:br/>
+              <w:t>Prod Reporting</w:t>
+              <w:br/>
+              <w:t>Production &amp; Emission Allocation Team</w:t>
+              <w:br/>
+              <w:br/>
+              <w:br/>
+              <w:t>[This notification is automatically generated by Pluto Hub ECaaS.]</w:t>
+            </w:r>
+          </w:p>
+        </w:tc>
+      </w:tr>
+    </w:tbl>
+    <w:p>
+      <w:r>
+        <w:rPr>
+          <w:b/>
+          <w:color w:val="007000"/>
+        </w:rPr>
+        <w:t>FIXED: the email subject/body now show 20 May 2026, matching the attached report.</w:t>
+      </w:r>
+    </w:p>
+    <w:p>
+      <w:pPr>
+        <w:pStyle w:val="Heading2"/>
+      </w:pPr>
+      <w:r>
+        <w:t>DB validation (per-message resolution)</w:t>
+      </w:r>
+    </w:p>
+    <w:p>
+      <w:r>
+        <w:t>getReportDate(message_no) now returns each message's OWN report date (vs the old by-type which returned the latest):</w:t>
       </w:r>
     </w:p>
     <w:tbl>
@@ -238,7 +499,7 @@
           </w:tcPr>
           <w:p>
             <w:r>
-              <w:t>Email subject</w:t>
+              <w:t>Own report date</w:t>
             </w:r>
           </w:p>
         </w:tc>
@@ -248,7 +509,7 @@
           </w:tcPr>
           <w:p>
             <w:r>
-              <w:t>Attachment file name</w:t>
+              <w:t>Fixed getReportDate(msg)</w:t>
             </w:r>
           </w:p>
         </w:tc>
@@ -258,7 +519,7 @@
           </w:tcPr>
           <w:p>
             <w:r>
-              <w:t>Created</w:t>
+              <w:t>Old getReportDate(type)</w:t>
             </w:r>
           </w:p>
         </w:tc>
@@ -270,7 +531,7 @@
           </w:tcPr>
           <w:p>
             <w:r>
-              <w:t>395</w:t>
+              <w:t>412 (before)</w:t>
             </w:r>
           </w:p>
         </w:tc>
@@ -280,7 +541,7 @@
           </w:tcPr>
           <w:p>
             <w:r>
-              <w:t>...for Production Date - 18 Jun 26</w:t>
+              <w:t>20 May 2026</w:t>
             </w:r>
           </w:p>
         </w:tc>
@@ -290,7 +551,7 @@
           </w:tcPr>
           <w:p>
             <w:r>
-              <w:t>Scarborough Upstream Daily Partner Report_18 Jun 2026.xlsx</w:t>
+              <w:t>20 May 2026 (correct)</w:t>
             </w:r>
           </w:p>
         </w:tc>
@@ -300,7 +561,7 @@
           </w:tcPr>
           <w:p>
             <w:r>
-              <w:t>2026-06-22 13:26</w:t>
+              <w:t>26 May 2026 (wrong)</w:t>
             </w:r>
           </w:p>
         </w:tc>
@@ -312,7 +573,7 @@
           </w:tcPr>
           <w:p>
             <w:r>
-              <w:t>394</w:t>
+              <w:t>414 (after)</w:t>
             </w:r>
           </w:p>
         </w:tc>
@@ -322,7 +583,7 @@
           </w:tcPr>
           <w:p>
             <w:r>
-              <w:t>...for Production Date - 18 Jun 26</w:t>
+              <w:t>20 May 2026</w:t>
             </w:r>
           </w:p>
         </w:tc>
@@ -332,7 +593,7 @@
           </w:tcPr>
           <w:p>
             <w:r>
-              <w:t>Scarborough Upstream Daily Partner Report_18 Jun 2026.pdf</w:t>
+              <w:t>20 May 2026 (correct)</w:t>
             </w:r>
           </w:p>
         </w:tc>
@@ -342,78 +603,7 @@
           </w:tcPr>
           <w:p>
             <w:r>
-              <w:t>2026-06-22 11:45</w:t>
-            </w:r>
-          </w:p>
-        </w:tc>
-      </w:tr>
-    </w:tbl>
-    <w:p>
-      <w:pPr>
-        <w:pStyle w:val="Heading2"/>
-      </w:pPr>
-      <w:r>
-        <w:t>3.2 Systematic proof on plutodev (read-only) — different report dates all stamped the SAME</w:t>
-      </w:r>
-    </w:p>
-    <w:p>
-      <w:r>
-        <w:rPr>
-          <w:b w:val="0"/>
-        </w:rPr>
-        <w:t>Calling the live resolver ZWP_P_MAIL_UTIL.getReportDate('R_PLU_DAILY_PARTNER') against six real generated reports of DIFFERENT production dates: every email is stamped with 26 May 2026 (the latest of the type) — so 5 of 6 are WRONG. This is the defect, reproduced systematically with known dates:</w:t>
-      </w:r>
-    </w:p>
-    <w:tbl>
-      <w:tblPr>
-        <w:tblStyle w:val="LightGrid-Accent1"/>
-        <w:tblW w:type="auto" w:w="0"/>
-        <w:tblLook w:firstColumn="1" w:firstRow="1" w:lastColumn="0" w:lastRow="0" w:noHBand="0" w:noVBand="1" w:val="04A0"/>
-      </w:tblPr>
-      <w:tblGrid>
-        <w:gridCol w:w="2160"/>
-        <w:gridCol w:w="2160"/>
-        <w:gridCol w:w="2160"/>
-        <w:gridCol w:w="2160"/>
-      </w:tblGrid>
-      <w:tr>
-        <w:tc>
-          <w:tcPr>
-            <w:tcW w:type="dxa" w:w="2160"/>
-          </w:tcPr>
-          <w:p>
-            <w:r>
-              <w:t>REPORT_NO</w:t>
-            </w:r>
-          </w:p>
-        </w:tc>
-        <w:tc>
-          <w:tcPr>
-            <w:tcW w:type="dxa" w:w="2160"/>
-          </w:tcPr>
-          <w:p>
-            <w:r>
-              <w:t>Actual report date</w:t>
-            </w:r>
-          </w:p>
-        </w:tc>
-        <w:tc>
-          <w:tcPr>
-            <w:tcW w:type="dxa" w:w="2160"/>
-          </w:tcPr>
-          <w:p>
-            <w:r>
-              <w:t>Date stamped on email</w:t>
-            </w:r>
-          </w:p>
-        </w:tc>
-        <w:tc>
-          <w:tcPr>
-            <w:tcW w:type="dxa" w:w="2160"/>
-          </w:tcPr>
-          <w:p>
-            <w:r>
-              <w:t>Result</w:t>
+              <w:t>26 May 2026 (wrong)</w:t>
             </w:r>
           </w:p>
         </w:tc>
@@ -425,175 +615,7 @@
           </w:tcPr>
           <w:p>
             <w:r>
-              <w:t>671</w:t>
-            </w:r>
-          </w:p>
-        </w:tc>
-        <w:tc>
-          <w:tcPr>
-            <w:tcW w:type="dxa" w:w="2160"/>
-          </w:tcPr>
-          <w:p>
-            <w:r>
-              <w:t>26 May 2026</w:t>
-            </w:r>
-          </w:p>
-        </w:tc>
-        <w:tc>
-          <w:tcPr>
-            <w:tcW w:type="dxa" w:w="2160"/>
-          </w:tcPr>
-          <w:p>
-            <w:r>
-              <w:t>26 May 2026</w:t>
-            </w:r>
-          </w:p>
-        </w:tc>
-        <w:tc>
-          <w:tcPr>
-            <w:tcW w:type="dxa" w:w="2160"/>
-          </w:tcPr>
-          <w:p>
-            <w:r>
-              <w:t>OK</w:t>
-            </w:r>
-          </w:p>
-        </w:tc>
-      </w:tr>
-      <w:tr>
-        <w:tc>
-          <w:tcPr>
-            <w:tcW w:type="dxa" w:w="2160"/>
-          </w:tcPr>
-          <w:p>
-            <w:r>
-              <w:t>668</w:t>
-            </w:r>
-          </w:p>
-        </w:tc>
-        <w:tc>
-          <w:tcPr>
-            <w:tcW w:type="dxa" w:w="2160"/>
-          </w:tcPr>
-          <w:p>
-            <w:r>
-              <w:t>25 May 2026</w:t>
-            </w:r>
-          </w:p>
-        </w:tc>
-        <w:tc>
-          <w:tcPr>
-            <w:tcW w:type="dxa" w:w="2160"/>
-          </w:tcPr>
-          <w:p>
-            <w:r>
-              <w:t>26 May 2026</w:t>
-            </w:r>
-          </w:p>
-        </w:tc>
-        <w:tc>
-          <w:tcPr>
-            <w:tcW w:type="dxa" w:w="2160"/>
-          </w:tcPr>
-          <w:p>
-            <w:r>
-              <w:t>WRONG</w:t>
-            </w:r>
-          </w:p>
-        </w:tc>
-      </w:tr>
-      <w:tr>
-        <w:tc>
-          <w:tcPr>
-            <w:tcW w:type="dxa" w:w="2160"/>
-          </w:tcPr>
-          <w:p>
-            <w:r>
-              <w:t>661</w:t>
-            </w:r>
-          </w:p>
-        </w:tc>
-        <w:tc>
-          <w:tcPr>
-            <w:tcW w:type="dxa" w:w="2160"/>
-          </w:tcPr>
-          <w:p>
-            <w:r>
-              <w:t>24 May 2026</w:t>
-            </w:r>
-          </w:p>
-        </w:tc>
-        <w:tc>
-          <w:tcPr>
-            <w:tcW w:type="dxa" w:w="2160"/>
-          </w:tcPr>
-          <w:p>
-            <w:r>
-              <w:t>26 May 2026</w:t>
-            </w:r>
-          </w:p>
-        </w:tc>
-        <w:tc>
-          <w:tcPr>
-            <w:tcW w:type="dxa" w:w="2160"/>
-          </w:tcPr>
-          <w:p>
-            <w:r>
-              <w:t>WRONG</w:t>
-            </w:r>
-          </w:p>
-        </w:tc>
-      </w:tr>
-      <w:tr>
-        <w:tc>
-          <w:tcPr>
-            <w:tcW w:type="dxa" w:w="2160"/>
-          </w:tcPr>
-          <w:p>
-            <w:r>
-              <w:t>659</w:t>
-            </w:r>
-          </w:p>
-        </w:tc>
-        <w:tc>
-          <w:tcPr>
-            <w:tcW w:type="dxa" w:w="2160"/>
-          </w:tcPr>
-          <w:p>
-            <w:r>
-              <w:t>23 May 2026</w:t>
-            </w:r>
-          </w:p>
-        </w:tc>
-        <w:tc>
-          <w:tcPr>
-            <w:tcW w:type="dxa" w:w="2160"/>
-          </w:tcPr>
-          <w:p>
-            <w:r>
-              <w:t>26 May 2026</w:t>
-            </w:r>
-          </w:p>
-        </w:tc>
-        <w:tc>
-          <w:tcPr>
-            <w:tcW w:type="dxa" w:w="2160"/>
-          </w:tcPr>
-          <w:p>
-            <w:r>
-              <w:t>WRONG</w:t>
-            </w:r>
-          </w:p>
-        </w:tc>
-      </w:tr>
-      <w:tr>
-        <w:tc>
-          <w:tcPr>
-            <w:tcW w:type="dxa" w:w="2160"/>
-          </w:tcPr>
-          <w:p>
-            <w:r>
-              <w:t>657</w:t>
+              <w:t>413 (after)</w:t>
             </w:r>
           </w:p>
         </w:tc>
@@ -613,7 +635,7 @@
           </w:tcPr>
           <w:p>
             <w:r>
-              <w:t>26 May 2026</w:t>
+              <w:t>22 May 2026 (correct)</w:t>
             </w:r>
           </w:p>
         </w:tc>
@@ -623,49 +645,7 @@
           </w:tcPr>
           <w:p>
             <w:r>
-              <w:t>WRONG</w:t>
-            </w:r>
-          </w:p>
-        </w:tc>
-      </w:tr>
-      <w:tr>
-        <w:tc>
-          <w:tcPr>
-            <w:tcW w:type="dxa" w:w="2160"/>
-          </w:tcPr>
-          <w:p>
-            <w:r>
-              <w:t>654</w:t>
-            </w:r>
-          </w:p>
-        </w:tc>
-        <w:tc>
-          <w:tcPr>
-            <w:tcW w:type="dxa" w:w="2160"/>
-          </w:tcPr>
-          <w:p>
-            <w:r>
-              <w:t>21 May 2026</w:t>
-            </w:r>
-          </w:p>
-        </w:tc>
-        <w:tc>
-          <w:tcPr>
-            <w:tcW w:type="dxa" w:w="2160"/>
-          </w:tcPr>
-          <w:p>
-            <w:r>
-              <w:t>26 May 2026</w:t>
-            </w:r>
-          </w:p>
-        </w:tc>
-        <w:tc>
-          <w:tcPr>
-            <w:tcW w:type="dxa" w:w="2160"/>
-          </w:tcPr>
-          <w:p>
-            <w:r>
-              <w:t>WRONG</w:t>
+              <w:t>26 May 2026 (wrong)</w:t>
             </w:r>
           </w:p>
         </w:tc>
@@ -673,74 +653,7 @@
     </w:tbl>
     <w:p>
       <w:r>
-        <w:rPr>
-          <w:b w:val="0"/>
-        </w:rPr>
-        <w:t>SQL used (read-only): SELECT report_no, TO_CHAR(report_date,'DD Mon YYYY'), ZWP_P_MAIL_UTIL.getReportDate('R_PLU_DAILY_PARTNER') FROM tv_report_generated WHERE zwp_template_code='R_PLU_DAILY_PARTNER' AND send_date IS NOT NULL.</w:t>
-      </w:r>
-    </w:p>
-    <w:p>
-      <w:pPr>
-        <w:pStyle w:val="Heading2"/>
-      </w:pPr>
-      <w:r>
-        <w:t>3.3 Conclusion</w:t>
-      </w:r>
-    </w:p>
-    <w:p>
-      <w:r>
-        <w:rPr>
-          <w:b/>
-        </w:rPr>
-        <w:t xml:space="preserve">DEFECT CONFIRMED VALID. </w:t>
-      </w:r>
-    </w:p>
-    <w:p>
-      <w:r>
-        <w:rPr>
-          <w:b w:val="0"/>
-        </w:rPr>
-        <w:t>Any Daily Partner email for a production date other than the most-recent report of that type is stamped with the wrong (latest) date in both the subject/body and the attachment file name, while the attached report content remains its own correct date — exactly as Ruchi reported.</w:t>
-      </w:r>
-    </w:p>
-    <w:p>
-      <w:pPr>
-        <w:pStyle w:val="Heading1"/>
-      </w:pPr>
-      <w:r>
-        <w:t>4. Next sections (to follow)</w:t>
-      </w:r>
-    </w:p>
-    <w:p>
-      <w:pPr>
-        <w:pStyle w:val="ListBullet"/>
-      </w:pPr>
-      <w:r>
-        <w:t>② Root cause + fix in ZWP_P_MAIL_UTIL (per-message date resolution)</w:t>
-      </w:r>
-    </w:p>
-    <w:p>
-      <w:pPr>
-        <w:pStyle w:val="ListBullet"/>
-      </w:pPr>
-      <w:r>
-        <w:t>③ APPLY FIX on plutodev</w:t>
-      </w:r>
-    </w:p>
-    <w:p>
-      <w:pPr>
-        <w:pStyle w:val="ListBullet"/>
-      </w:pPr>
-      <w:r>
-        <w:t>④ AFTER — re-verify (two dates → correct, distinct subjects)</w:t>
-      </w:r>
-    </w:p>
-    <w:p>
-      <w:pPr>
-        <w:pStyle w:val="ListBullet"/>
-      </w:pPr>
-      <w:r>
-        <w:t>⑤ SELF-CLEAN</w:t>
+        <w:t>Package ZWP_P_MAIL_UTIL re-compiled VALID on COPSDEV; both updateMsgOutFromMsgTemplate (MESSAGE_OUT) and updateMHMFromMsgTemplate (MHM_MSG) resolve per-message; all 359 MHM_MSG.MESSAGE_ID values map to REPORT_SEND_LOG.MESSAGE_NO.</w:t>
       </w:r>
     </w:p>
     <w:sectPr>

</xml_diff>